<commit_message>
Add Russian UI, settings tabs, 103 jobs and one-page print guarantee
- Interface language English/Russian (ptw/i18n.py), switchable in Settings
- Settings dialog with General / Files / Permit / Generation / Print tabs:
  UI font size, file name preview, open folder after creating, weekdays
  without permits, font fitting options, reset to defaults
- 52 more engine jobs (103 total), RA placeholders RA-001..RA-103
- Values are measured with Times New Roman metrics and shrunk (or cut
  with an ellipsis as a last resort) so every permit stays on one page;
  big teams use compact ranks; job and crew editors warn about long text
- tools/check_print.py renders all jobs through LibreOffice and checks
  one page / one line per value; build.bat and BUILD.md for the exe

Co-Authored-By: Claude Opus 5.5 <noreply@anthropic.com>
Claude-Session: https://claude.ai/code/session_016om9JXbtzFWX32uPwNCGoD
</commit_message>
<xml_diff>
--- a/templates/ptw_template.docx
+++ b/templates/ptw_template.docx
@@ -3743,7 +3743,17 @@
                 <w:highlight w:val="yellow"/>
                 <w:lang w:val="en-US"/>
               </w:rPr>
-              <w:t xml:space="preserve">verified according to Risk Assessment number {{RA_NO}}</w:t>
+              <w:t xml:space="preserve">verified according to Risk Assessment number </w:t>
+            </w:r>
+            <w:r>
+              <w:rPr>
+                <w:rFonts w:ascii="Times New Roman" w:hAnsi="Times New Roman"/>
+                <w:sz w:val="18"/>
+                <w:szCs w:val="18"/>
+                <w:highlight w:val="yellow"/>
+                <w:lang w:val="en-US"/>
+              </w:rPr>
+              <w:t xml:space="preserve">{{RA_NO}}</w:t>
             </w:r>
           </w:p>
         </w:tc>

</xml_diff>